<commit_message>
To Set Show and Hide Columns in Datatable using these fields ( Reference,Employee Name / ID,Device Serial No,Department,Category, Warranty Date & Status
</commit_message>
<xml_diff>
--- a/claimed-raised/current_claimed.docx
+++ b/claimed-raised/current_claimed.docx
@@ -1070,6 +1070,45 @@
       </w:r>
     </w:p>
     <w:p/>
+    <w:p>
+      <w:r>
+        <w:drawing>
+          <wp:inline distT="0" distB="0" distL="0" distR="0" wp14:anchorId="7B1D1381" wp14:editId="25823506">
+            <wp:extent cx="2133785" cy="4839119"/>
+            <wp:effectExtent l="0" t="0" r="0" b="0"/>
+            <wp:docPr id="1912718956" name="Picture 1"/>
+            <wp:cNvGraphicFramePr>
+              <a:graphicFrameLocks xmlns:a="http://schemas.openxmlformats.org/drawingml/2006/main" noChangeAspect="1"/>
+            </wp:cNvGraphicFramePr>
+            <a:graphic xmlns:a="http://schemas.openxmlformats.org/drawingml/2006/main">
+              <a:graphicData uri="http://schemas.openxmlformats.org/drawingml/2006/picture">
+                <pic:pic xmlns:pic="http://schemas.openxmlformats.org/drawingml/2006/picture">
+                  <pic:nvPicPr>
+                    <pic:cNvPr id="1912718956" name=""/>
+                    <pic:cNvPicPr/>
+                  </pic:nvPicPr>
+                  <pic:blipFill>
+                    <a:blip r:embed="rId10"/>
+                    <a:stretch>
+                      <a:fillRect/>
+                    </a:stretch>
+                  </pic:blipFill>
+                  <pic:spPr>
+                    <a:xfrm>
+                      <a:off x="0" y="0"/>
+                      <a:ext cx="2133785" cy="4839119"/>
+                    </a:xfrm>
+                    <a:prstGeom prst="rect">
+                      <a:avLst/>
+                    </a:prstGeom>
+                  </pic:spPr>
+                </pic:pic>
+              </a:graphicData>
+            </a:graphic>
+          </wp:inline>
+        </w:drawing>
+      </w:r>
+    </w:p>
     <w:sectPr>
       <w:pgSz w:w="12240" w:h="15840"/>
       <w:pgMar w:top="1440" w:right="1440" w:bottom="1440" w:left="1440" w:header="720" w:footer="720" w:gutter="0"/>

</xml_diff>

<commit_message>
To Set Show and Hide Columns and Proper Space Gapping among all Column Fields
</commit_message>
<xml_diff>
--- a/claimed-raised/current_claimed.docx
+++ b/claimed-raised/current_claimed.docx
@@ -7,15 +7,7 @@
     <w:p/>
     <w:p>
       <w:r>
-        <w:t xml:space="preserve">WITH </w:t>
-      </w:r>
-      <w:proofErr w:type="spellStart"/>
-      <w:r>
-        <w:t>year_bounds</w:t>
-      </w:r>
-      <w:proofErr w:type="spellEnd"/>
-      <w:r>
-        <w:t xml:space="preserve"> AS (</w:t>
+        <w:t>WITH year_bounds AS (</w:t>
       </w:r>
     </w:p>
     <w:p>
@@ -25,58 +17,13 @@
     </w:p>
     <w:p>
       <w:r>
-        <w:t xml:space="preserve">        DATE_</w:t>
-      </w:r>
-      <w:proofErr w:type="gramStart"/>
-      <w:r>
-        <w:t>TRUNC(</w:t>
-      </w:r>
-      <w:proofErr w:type="gramEnd"/>
-      <w:r>
-        <w:t>'year', CURRENT_DATE</w:t>
-      </w:r>
-      <w:proofErr w:type="gramStart"/>
-      <w:r>
-        <w:t>)::</w:t>
-      </w:r>
-      <w:proofErr w:type="gramEnd"/>
-      <w:r>
-        <w:t xml:space="preserve">date AS </w:t>
-      </w:r>
-      <w:proofErr w:type="spellStart"/>
-      <w:r>
-        <w:t>year_start</w:t>
-      </w:r>
-      <w:proofErr w:type="spellEnd"/>
-      <w:r>
-        <w:t>,</w:t>
-      </w:r>
-    </w:p>
-    <w:p>
-      <w:r>
-        <w:t xml:space="preserve">        (DATE_</w:t>
-      </w:r>
-      <w:proofErr w:type="gramStart"/>
-      <w:r>
-        <w:t>TRUNC(</w:t>
-      </w:r>
-      <w:proofErr w:type="gramEnd"/>
-      <w:r>
-        <w:t>'year', CURRENT_DATE) + INTERVAL '1 year'</w:t>
-      </w:r>
-      <w:proofErr w:type="gramStart"/>
-      <w:r>
-        <w:t>)::</w:t>
-      </w:r>
-      <w:proofErr w:type="gramEnd"/>
-      <w:r>
-        <w:t xml:space="preserve">date AS </w:t>
-      </w:r>
-      <w:proofErr w:type="spellStart"/>
-      <w:r>
-        <w:t>next_year_start</w:t>
-      </w:r>
-      <w:proofErr w:type="spellEnd"/>
+        <w:t xml:space="preserve">        DATE_TRUNC('year', CURRENT_DATE)::date AS year_start,</w:t>
+      </w:r>
+    </w:p>
+    <w:p>
+      <w:r>
+        <w:t xml:space="preserve">        (DATE_TRUNC('year', CURRENT_DATE) + INTERVAL '1 year')::date AS next_year_start</w:t>
+      </w:r>
     </w:p>
     <w:p>
       <w:r>
@@ -85,298 +32,95 @@
     </w:p>
     <w:p/>
     <w:p>
-      <w:proofErr w:type="spellStart"/>
-      <w:r>
-        <w:t>recovered_rows</w:t>
-      </w:r>
-      <w:proofErr w:type="spellEnd"/>
-      <w:r>
-        <w:t xml:space="preserve"> AS (</w:t>
-      </w:r>
-    </w:p>
-    <w:p>
-      <w:r>
-        <w:t xml:space="preserve">    SELECT DISTINCT ON (</w:t>
-      </w:r>
-      <w:proofErr w:type="spellStart"/>
-      <w:proofErr w:type="gramStart"/>
-      <w:r>
-        <w:t>dc.reference</w:t>
-      </w:r>
-      <w:proofErr w:type="gramEnd"/>
-      <w:r>
-        <w:t>_no_claim</w:t>
-      </w:r>
-      <w:proofErr w:type="spellEnd"/>
+      <w:r>
+        <w:t>recovered_rows AS (</w:t>
+      </w:r>
+    </w:p>
+    <w:p>
+      <w:r>
+        <w:t xml:space="preserve">    SELECT DISTINCT ON (dc.reference_no_claim)</w:t>
+      </w:r>
+    </w:p>
+    <w:p>
+      <w:r>
+        <w:t xml:space="preserve">        dc.reference_no_claim,</w:t>
+      </w:r>
+    </w:p>
+    <w:p>
+      <w:r>
+        <w:t xml:space="preserve">        dc.return_date AS closing_date</w:t>
+      </w:r>
+    </w:p>
+    <w:p>
+      <w:r>
+        <w:t xml:space="preserve">    FROM public.device_claims dc</w:t>
+      </w:r>
+    </w:p>
+    <w:p>
+      <w:r>
+        <w:t xml:space="preserve">    CROSS JOIN year_bounds yb</w:t>
+      </w:r>
+    </w:p>
+    <w:p>
+      <w:r>
+        <w:t xml:space="preserve">    WHERE dc.claim_status = 10</w:t>
+      </w:r>
+    </w:p>
+    <w:p>
+      <w:r>
+        <w:t xml:space="preserve">      AND dc.reference_no_claim IS NOT NULL</w:t>
+      </w:r>
+    </w:p>
+    <w:p>
+      <w:r>
+        <w:t xml:space="preserve">      AND dc.return_date IS NOT NULL</w:t>
+      </w:r>
+    </w:p>
+    <w:p>
+      <w:r>
+        <w:t xml:space="preserve">      AND dc.return_date::date &gt;= yb.year_start</w:t>
+      </w:r>
+    </w:p>
+    <w:p>
+      <w:r>
+        <w:t xml:space="preserve">      AND dc.return_date::date &lt; yb.next_year_start</w:t>
+      </w:r>
+    </w:p>
+    <w:p>
+      <w:r>
+        <w:t xml:space="preserve">    ORDER BY</w:t>
+      </w:r>
+    </w:p>
+    <w:p>
+      <w:r>
+        <w:t xml:space="preserve">        dc.reference_no_claim,</w:t>
+      </w:r>
+    </w:p>
+    <w:p>
+      <w:r>
+        <w:t xml:space="preserve">        dc.return_date DESC NULLS LAST,</w:t>
+      </w:r>
+    </w:p>
+    <w:p>
+      <w:r>
+        <w:t xml:space="preserve">        dc.id DESC</w:t>
+      </w:r>
+    </w:p>
+    <w:p>
       <w:r>
         <w:t>)</w:t>
       </w:r>
     </w:p>
-    <w:p>
-      <w:r>
-        <w:t xml:space="preserve">        </w:t>
-      </w:r>
-      <w:proofErr w:type="spellStart"/>
-      <w:r>
-        <w:t>dc.reference_no_claim</w:t>
-      </w:r>
-      <w:proofErr w:type="spellEnd"/>
-      <w:r>
-        <w:t>,</w:t>
-      </w:r>
-    </w:p>
-    <w:p>
-      <w:r>
-        <w:t xml:space="preserve">        </w:t>
-      </w:r>
-      <w:proofErr w:type="spellStart"/>
-      <w:r>
-        <w:t>dc.return_date</w:t>
-      </w:r>
-      <w:proofErr w:type="spellEnd"/>
-      <w:r>
-        <w:t xml:space="preserve"> AS </w:t>
-      </w:r>
-      <w:proofErr w:type="spellStart"/>
-      <w:r>
-        <w:t>closing_date</w:t>
-      </w:r>
-      <w:proofErr w:type="spellEnd"/>
-    </w:p>
-    <w:p>
-      <w:r>
-        <w:t xml:space="preserve">    FROM </w:t>
-      </w:r>
-      <w:proofErr w:type="spellStart"/>
-      <w:proofErr w:type="gramStart"/>
-      <w:r>
-        <w:t>public.device</w:t>
-      </w:r>
-      <w:proofErr w:type="gramEnd"/>
-      <w:r>
-        <w:t>_claims</w:t>
-      </w:r>
-      <w:proofErr w:type="spellEnd"/>
-      <w:r>
-        <w:t xml:space="preserve"> dc</w:t>
-      </w:r>
-    </w:p>
-    <w:p>
-      <w:r>
-        <w:t xml:space="preserve">    CROSS JOIN </w:t>
-      </w:r>
-      <w:proofErr w:type="spellStart"/>
-      <w:r>
-        <w:t>year_bounds</w:t>
-      </w:r>
-      <w:proofErr w:type="spellEnd"/>
-      <w:r>
-        <w:t xml:space="preserve"> </w:t>
-      </w:r>
-      <w:proofErr w:type="spellStart"/>
-      <w:r>
-        <w:t>yb</w:t>
-      </w:r>
-      <w:proofErr w:type="spellEnd"/>
-    </w:p>
-    <w:p>
-      <w:r>
-        <w:t xml:space="preserve">    WHERE </w:t>
-      </w:r>
-      <w:proofErr w:type="spellStart"/>
-      <w:proofErr w:type="gramStart"/>
-      <w:r>
-        <w:t>dc.claim</w:t>
-      </w:r>
-      <w:proofErr w:type="gramEnd"/>
-      <w:r>
-        <w:t>_status</w:t>
-      </w:r>
-      <w:proofErr w:type="spellEnd"/>
-      <w:r>
-        <w:t xml:space="preserve"> = 10</w:t>
-      </w:r>
-    </w:p>
-    <w:p>
-      <w:r>
-        <w:t xml:space="preserve">      AND </w:t>
-      </w:r>
-      <w:proofErr w:type="spellStart"/>
-      <w:proofErr w:type="gramStart"/>
-      <w:r>
-        <w:t>dc.reference</w:t>
-      </w:r>
-      <w:proofErr w:type="gramEnd"/>
-      <w:r>
-        <w:t>_no_claim</w:t>
-      </w:r>
-      <w:proofErr w:type="spellEnd"/>
-      <w:r>
-        <w:t xml:space="preserve"> IS NOT NULL</w:t>
-      </w:r>
-    </w:p>
-    <w:p>
-      <w:r>
-        <w:t xml:space="preserve">      AND </w:t>
-      </w:r>
-      <w:proofErr w:type="spellStart"/>
-      <w:proofErr w:type="gramStart"/>
-      <w:r>
-        <w:t>dc.return</w:t>
-      </w:r>
-      <w:proofErr w:type="gramEnd"/>
-      <w:r>
-        <w:t>_date</w:t>
-      </w:r>
-      <w:proofErr w:type="spellEnd"/>
-      <w:r>
-        <w:t xml:space="preserve"> IS NOT NULL</w:t>
-      </w:r>
-    </w:p>
-    <w:p>
-      <w:r>
-        <w:t xml:space="preserve">      AND </w:t>
-      </w:r>
-      <w:proofErr w:type="spellStart"/>
-      <w:proofErr w:type="gramStart"/>
-      <w:r>
-        <w:t>dc.return</w:t>
-      </w:r>
-      <w:proofErr w:type="gramEnd"/>
-      <w:r>
-        <w:t>_</w:t>
-      </w:r>
-      <w:proofErr w:type="gramStart"/>
-      <w:r>
-        <w:t>date</w:t>
-      </w:r>
-      <w:proofErr w:type="spellEnd"/>
-      <w:r>
-        <w:t>::</w:t>
-      </w:r>
-      <w:proofErr w:type="gramEnd"/>
-      <w:r>
-        <w:t xml:space="preserve">date &gt;= </w:t>
-      </w:r>
-      <w:proofErr w:type="spellStart"/>
-      <w:proofErr w:type="gramStart"/>
-      <w:r>
-        <w:t>yb.year</w:t>
-      </w:r>
-      <w:proofErr w:type="gramEnd"/>
-      <w:r>
-        <w:t>_start</w:t>
-      </w:r>
-      <w:proofErr w:type="spellEnd"/>
-    </w:p>
-    <w:p>
-      <w:r>
-        <w:t xml:space="preserve">      AND </w:t>
-      </w:r>
-      <w:proofErr w:type="spellStart"/>
-      <w:proofErr w:type="gramStart"/>
-      <w:r>
-        <w:t>dc.return</w:t>
-      </w:r>
-      <w:proofErr w:type="gramEnd"/>
-      <w:r>
-        <w:t>_</w:t>
-      </w:r>
-      <w:proofErr w:type="gramStart"/>
-      <w:r>
-        <w:t>date</w:t>
-      </w:r>
-      <w:proofErr w:type="spellEnd"/>
-      <w:r>
-        <w:t>::</w:t>
-      </w:r>
-      <w:proofErr w:type="gramEnd"/>
-      <w:r>
-        <w:t xml:space="preserve">date &lt; </w:t>
-      </w:r>
-      <w:proofErr w:type="spellStart"/>
-      <w:proofErr w:type="gramStart"/>
-      <w:r>
-        <w:t>yb.next</w:t>
-      </w:r>
-      <w:proofErr w:type="gramEnd"/>
-      <w:r>
-        <w:t>_year_start</w:t>
-      </w:r>
-      <w:proofErr w:type="spellEnd"/>
-    </w:p>
-    <w:p>
-      <w:r>
-        <w:t xml:space="preserve">    ORDER BY</w:t>
-      </w:r>
-    </w:p>
-    <w:p>
-      <w:r>
-        <w:t xml:space="preserve">        </w:t>
-      </w:r>
-      <w:proofErr w:type="spellStart"/>
-      <w:r>
-        <w:t>dc.reference_no_claim</w:t>
-      </w:r>
-      <w:proofErr w:type="spellEnd"/>
-      <w:r>
-        <w:t>,</w:t>
-      </w:r>
-    </w:p>
-    <w:p>
-      <w:r>
-        <w:t xml:space="preserve">        </w:t>
-      </w:r>
-      <w:proofErr w:type="spellStart"/>
-      <w:r>
-        <w:t>dc.return_date</w:t>
-      </w:r>
-      <w:proofErr w:type="spellEnd"/>
-      <w:r>
-        <w:t xml:space="preserve"> DESC NULLS LAST,</w:t>
-      </w:r>
-    </w:p>
-    <w:p>
-      <w:r>
-        <w:t xml:space="preserve">        dc.id DESC</w:t>
-      </w:r>
-    </w:p>
-    <w:p>
-      <w:r>
-        <w:t>)</w:t>
-      </w:r>
-    </w:p>
     <w:p/>
     <w:p>
       <w:r>
         <w:lastRenderedPageBreak/>
-        <w:t xml:space="preserve">SELECT </w:t>
-      </w:r>
-      <w:proofErr w:type="gramStart"/>
-      <w:r>
-        <w:t>COUNT(</w:t>
-      </w:r>
-      <w:proofErr w:type="gramEnd"/>
-      <w:r>
-        <w:t xml:space="preserve">*) AS </w:t>
-      </w:r>
-      <w:proofErr w:type="spellStart"/>
-      <w:r>
-        <w:t>recovered_count</w:t>
-      </w:r>
-      <w:proofErr w:type="spellEnd"/>
-    </w:p>
-    <w:p>
-      <w:r>
-        <w:t xml:space="preserve">FROM </w:t>
-      </w:r>
-      <w:proofErr w:type="spellStart"/>
-      <w:r>
-        <w:t>recovered_rows</w:t>
-      </w:r>
-      <w:proofErr w:type="spellEnd"/>
-      <w:r>
-        <w:t>;</w:t>
+        <w:t>SELECT COUNT(*) AS recovered_count</w:t>
+      </w:r>
+    </w:p>
+    <w:p>
+      <w:r>
+        <w:t>FROM recovered_rows;</w:t>
       </w:r>
     </w:p>
     <w:p/>
@@ -431,208 +175,48 @@
     </w:p>
     <w:p>
       <w:r>
-        <w:t xml:space="preserve">    </w:t>
-      </w:r>
-      <w:proofErr w:type="spellStart"/>
-      <w:r>
-        <w:t>dc.reference_no_claim</w:t>
-      </w:r>
-      <w:proofErr w:type="spellEnd"/>
-      <w:r>
-        <w:t>,</w:t>
-      </w:r>
-    </w:p>
-    <w:p>
-      <w:r>
-        <w:t xml:space="preserve">    </w:t>
-      </w:r>
-      <w:proofErr w:type="gramStart"/>
-      <w:r>
-        <w:t>MAX(</w:t>
-      </w:r>
-      <w:proofErr w:type="spellStart"/>
-      <w:r>
-        <w:t>dc.return</w:t>
-      </w:r>
-      <w:proofErr w:type="gramEnd"/>
-      <w:r>
-        <w:t>_date</w:t>
-      </w:r>
-      <w:proofErr w:type="spellEnd"/>
-      <w:r>
-        <w:t xml:space="preserve">) AS </w:t>
-      </w:r>
-      <w:proofErr w:type="spellStart"/>
-      <w:r>
-        <w:t>closing_date</w:t>
-      </w:r>
-      <w:proofErr w:type="spellEnd"/>
-    </w:p>
-    <w:p>
-      <w:r>
-        <w:t xml:space="preserve">FROM </w:t>
-      </w:r>
-      <w:proofErr w:type="spellStart"/>
-      <w:proofErr w:type="gramStart"/>
-      <w:r>
-        <w:t>public.device</w:t>
-      </w:r>
-      <w:proofErr w:type="gramEnd"/>
-      <w:r>
-        <w:t>_claims</w:t>
-      </w:r>
-      <w:proofErr w:type="spellEnd"/>
-      <w:r>
-        <w:t xml:space="preserve"> dc</w:t>
-      </w:r>
-    </w:p>
-    <w:p>
-      <w:r>
-        <w:t xml:space="preserve">WHERE </w:t>
-      </w:r>
-      <w:proofErr w:type="spellStart"/>
-      <w:proofErr w:type="gramStart"/>
-      <w:r>
-        <w:t>dc.claim</w:t>
-      </w:r>
-      <w:proofErr w:type="gramEnd"/>
-      <w:r>
-        <w:t>_status</w:t>
-      </w:r>
-      <w:proofErr w:type="spellEnd"/>
-      <w:r>
-        <w:t xml:space="preserve"> = 10</w:t>
-      </w:r>
-    </w:p>
-    <w:p>
-      <w:r>
-        <w:t xml:space="preserve">  AND </w:t>
-      </w:r>
-      <w:proofErr w:type="spellStart"/>
-      <w:proofErr w:type="gramStart"/>
-      <w:r>
-        <w:t>dc.return</w:t>
-      </w:r>
-      <w:proofErr w:type="gramEnd"/>
-      <w:r>
-        <w:t>_date</w:t>
-      </w:r>
-      <w:proofErr w:type="spellEnd"/>
-      <w:r>
-        <w:t xml:space="preserve"> IS NOT NULL</w:t>
-      </w:r>
-    </w:p>
-    <w:p>
-      <w:r>
-        <w:t xml:space="preserve">  AND </w:t>
-      </w:r>
-      <w:proofErr w:type="spellStart"/>
-      <w:proofErr w:type="gramStart"/>
-      <w:r>
-        <w:t>dc.return</w:t>
-      </w:r>
-      <w:proofErr w:type="gramEnd"/>
-      <w:r>
-        <w:t>_</w:t>
-      </w:r>
-      <w:proofErr w:type="gramStart"/>
-      <w:r>
-        <w:t>date</w:t>
-      </w:r>
-      <w:proofErr w:type="spellEnd"/>
-      <w:r>
-        <w:t>::</w:t>
-      </w:r>
-      <w:proofErr w:type="gramEnd"/>
-      <w:r>
-        <w:t>date &gt;= DATE_</w:t>
-      </w:r>
-      <w:proofErr w:type="gramStart"/>
-      <w:r>
-        <w:t>TRUNC(</w:t>
-      </w:r>
-      <w:proofErr w:type="gramEnd"/>
-      <w:r>
-        <w:t>'year', CURRENT_DATE</w:t>
-      </w:r>
-      <w:proofErr w:type="gramStart"/>
-      <w:r>
-        <w:t>)::</w:t>
-      </w:r>
-      <w:proofErr w:type="gramEnd"/>
-      <w:r>
-        <w:t>date</w:t>
+        <w:t xml:space="preserve">    dc.reference_no_claim,</w:t>
+      </w:r>
+    </w:p>
+    <w:p>
+      <w:r>
+        <w:t xml:space="preserve">    MAX(dc.return_date) AS closing_date</w:t>
+      </w:r>
+    </w:p>
+    <w:p>
+      <w:r>
+        <w:t>FROM public.device_claims dc</w:t>
+      </w:r>
+    </w:p>
+    <w:p>
+      <w:r>
+        <w:t>WHERE dc.claim_status = 10</w:t>
+      </w:r>
+    </w:p>
+    <w:p>
+      <w:r>
+        <w:t xml:space="preserve">  AND dc.return_date IS NOT NULL</w:t>
+      </w:r>
+    </w:p>
+    <w:p>
+      <w:r>
+        <w:t xml:space="preserve">  AND dc.return_date::date &gt;= DATE_TRUNC('year', CURRENT_DATE)::date</w:t>
       </w:r>
     </w:p>
     <w:p>
       <w:r>
         <w:lastRenderedPageBreak/>
-        <w:t xml:space="preserve">  AND </w:t>
-      </w:r>
-      <w:proofErr w:type="spellStart"/>
-      <w:proofErr w:type="gramStart"/>
-      <w:r>
-        <w:t>dc.return</w:t>
-      </w:r>
-      <w:proofErr w:type="gramEnd"/>
-      <w:r>
-        <w:t>_</w:t>
-      </w:r>
-      <w:proofErr w:type="gramStart"/>
-      <w:r>
-        <w:t>date</w:t>
-      </w:r>
-      <w:proofErr w:type="spellEnd"/>
-      <w:r>
-        <w:t>::</w:t>
-      </w:r>
-      <w:proofErr w:type="gramEnd"/>
-      <w:r>
-        <w:t>date &lt; (DATE_</w:t>
-      </w:r>
-      <w:proofErr w:type="gramStart"/>
-      <w:r>
-        <w:t>TRUNC(</w:t>
-      </w:r>
-      <w:proofErr w:type="gramEnd"/>
-      <w:r>
-        <w:t>'year', CURRENT_DATE) + INTERVAL '1 year'</w:t>
-      </w:r>
-      <w:proofErr w:type="gramStart"/>
-      <w:r>
-        <w:t>)::</w:t>
-      </w:r>
-      <w:proofErr w:type="gramEnd"/>
-      <w:r>
-        <w:t>date</w:t>
-      </w:r>
-    </w:p>
-    <w:p>
-      <w:r>
-        <w:t xml:space="preserve">GROUP BY </w:t>
-      </w:r>
-      <w:proofErr w:type="spellStart"/>
-      <w:proofErr w:type="gramStart"/>
-      <w:r>
-        <w:t>dc.reference</w:t>
-      </w:r>
-      <w:proofErr w:type="gramEnd"/>
-      <w:r>
-        <w:t>_no_claim</w:t>
-      </w:r>
-      <w:proofErr w:type="spellEnd"/>
-    </w:p>
-    <w:p>
-      <w:r>
-        <w:t xml:space="preserve">ORDER BY </w:t>
-      </w:r>
-      <w:proofErr w:type="spellStart"/>
-      <w:r>
-        <w:t>closing_date</w:t>
-      </w:r>
-      <w:proofErr w:type="spellEnd"/>
-      <w:r>
-        <w:t xml:space="preserve"> DESC;</w:t>
+        <w:t xml:space="preserve">  AND dc.return_date::date &lt; (DATE_TRUNC('year', CURRENT_DATE) + INTERVAL '1 year')::date</w:t>
+      </w:r>
+    </w:p>
+    <w:p>
+      <w:r>
+        <w:t>GROUP BY dc.reference_no_claim</w:t>
+      </w:r>
+    </w:p>
+    <w:p>
+      <w:r>
+        <w:t>ORDER BY closing_date DESC;</w:t>
       </w:r>
     </w:p>
     <w:p/>
@@ -694,159 +278,42 @@
     </w:p>
     <w:p>
       <w:r>
-        <w:t xml:space="preserve">    </w:t>
-      </w:r>
-      <w:proofErr w:type="spellStart"/>
-      <w:proofErr w:type="gramStart"/>
-      <w:r>
-        <w:t>h.claim</w:t>
-      </w:r>
-      <w:proofErr w:type="gramEnd"/>
-      <w:r>
-        <w:t>_reference_no</w:t>
-      </w:r>
-      <w:proofErr w:type="spellEnd"/>
-      <w:r>
-        <w:t>,</w:t>
-      </w:r>
-    </w:p>
-    <w:p>
-      <w:r>
-        <w:t xml:space="preserve">    MAX(</w:t>
-      </w:r>
-      <w:proofErr w:type="spellStart"/>
-      <w:proofErr w:type="gramStart"/>
-      <w:r>
-        <w:t>h.created</w:t>
-      </w:r>
-      <w:proofErr w:type="gramEnd"/>
-      <w:r>
-        <w:t>_at</w:t>
-      </w:r>
-      <w:proofErr w:type="spellEnd"/>
-      <w:r>
-        <w:t xml:space="preserve">) AS </w:t>
-      </w:r>
-      <w:proofErr w:type="spellStart"/>
-      <w:r>
-        <w:t>closing_date</w:t>
-      </w:r>
-      <w:proofErr w:type="spellEnd"/>
-    </w:p>
-    <w:p>
-      <w:r>
-        <w:t xml:space="preserve">FROM </w:t>
-      </w:r>
-      <w:proofErr w:type="spellStart"/>
-      <w:proofErr w:type="gramStart"/>
-      <w:r>
-        <w:t>public.device</w:t>
-      </w:r>
-      <w:proofErr w:type="gramEnd"/>
-      <w:r>
-        <w:t>_claim_histories</w:t>
-      </w:r>
-      <w:proofErr w:type="spellEnd"/>
-      <w:r>
-        <w:t xml:space="preserve"> h</w:t>
-      </w:r>
-    </w:p>
-    <w:p>
-      <w:r>
-        <w:t xml:space="preserve">WHERE </w:t>
-      </w:r>
-      <w:proofErr w:type="spellStart"/>
-      <w:proofErr w:type="gramStart"/>
-      <w:r>
-        <w:t>h.current</w:t>
-      </w:r>
-      <w:proofErr w:type="gramEnd"/>
-      <w:r>
-        <w:t>_status</w:t>
-      </w:r>
-      <w:proofErr w:type="spellEnd"/>
-      <w:r>
-        <w:t xml:space="preserve"> = 10</w:t>
-      </w:r>
-    </w:p>
-    <w:p>
-      <w:r>
-        <w:t xml:space="preserve">  AND </w:t>
-      </w:r>
-      <w:proofErr w:type="spellStart"/>
-      <w:proofErr w:type="gramStart"/>
-      <w:r>
-        <w:t>h.created</w:t>
-      </w:r>
-      <w:proofErr w:type="gramEnd"/>
-      <w:r>
-        <w:t>_at</w:t>
-      </w:r>
-      <w:proofErr w:type="spellEnd"/>
-      <w:r>
-        <w:t xml:space="preserve"> &gt;= DATE_</w:t>
-      </w:r>
-      <w:proofErr w:type="gramStart"/>
-      <w:r>
-        <w:t>TRUNC(</w:t>
-      </w:r>
-      <w:proofErr w:type="gramEnd"/>
-      <w:r>
-        <w:t>'year', CURRENT_DATE)</w:t>
-      </w:r>
-    </w:p>
-    <w:p>
-      <w:r>
-        <w:t xml:space="preserve">  AND </w:t>
-      </w:r>
-      <w:proofErr w:type="spellStart"/>
-      <w:proofErr w:type="gramStart"/>
-      <w:r>
-        <w:t>h.created</w:t>
-      </w:r>
-      <w:proofErr w:type="gramEnd"/>
-      <w:r>
-        <w:t>_at</w:t>
-      </w:r>
-      <w:proofErr w:type="spellEnd"/>
-      <w:r>
-        <w:t xml:space="preserve"> &lt; DATE_</w:t>
-      </w:r>
-      <w:proofErr w:type="gramStart"/>
-      <w:r>
-        <w:t>TRUNC(</w:t>
-      </w:r>
-      <w:proofErr w:type="gramEnd"/>
-      <w:r>
-        <w:t>'year', CURRENT_DATE) + INTERVAL '1 year'</w:t>
-      </w:r>
-    </w:p>
-    <w:p>
-      <w:r>
-        <w:t xml:space="preserve">GROUP BY </w:t>
-      </w:r>
-      <w:proofErr w:type="spellStart"/>
-      <w:proofErr w:type="gramStart"/>
-      <w:r>
-        <w:t>h.claim</w:t>
-      </w:r>
-      <w:proofErr w:type="gramEnd"/>
-      <w:r>
-        <w:t>_reference_no</w:t>
-      </w:r>
-      <w:proofErr w:type="spellEnd"/>
-    </w:p>
-    <w:p>
-      <w:r>
-        <w:t xml:space="preserve">ORDER BY </w:t>
-      </w:r>
-      <w:proofErr w:type="spellStart"/>
-      <w:r>
-        <w:t>closing_date</w:t>
-      </w:r>
-      <w:proofErr w:type="spellEnd"/>
-      <w:r>
-        <w:t xml:space="preserve"> DESC;</w:t>
+        <w:t xml:space="preserve">    h.claim_reference_no,</w:t>
+      </w:r>
+    </w:p>
+    <w:p>
+      <w:r>
+        <w:t xml:space="preserve">    MAX(h.created_at) AS closing_date</w:t>
+      </w:r>
+    </w:p>
+    <w:p>
+      <w:r>
+        <w:t>FROM public.device_claim_histories h</w:t>
+      </w:r>
+    </w:p>
+    <w:p>
+      <w:r>
+        <w:t>WHERE h.current_status = 10</w:t>
+      </w:r>
+    </w:p>
+    <w:p>
+      <w:r>
+        <w:t xml:space="preserve">  AND h.created_at &gt;= DATE_TRUNC('year', CURRENT_DATE)</w:t>
+      </w:r>
+    </w:p>
+    <w:p>
+      <w:r>
+        <w:t xml:space="preserve">  AND h.created_at &lt; DATE_TRUNC('year', CURRENT_DATE) + INTERVAL '1 year'</w:t>
+      </w:r>
+    </w:p>
+    <w:p>
+      <w:r>
+        <w:t>GROUP BY h.claim_reference_no</w:t>
+      </w:r>
+    </w:p>
+    <w:p>
+      <w:r>
+        <w:t>ORDER BY closing_date DESC;</w:t>
       </w:r>
     </w:p>
     <w:p/>
@@ -1097,6 +564,49 @@
                     <a:xfrm>
                       <a:off x="0" y="0"/>
                       <a:ext cx="2133785" cy="4839119"/>
+                    </a:xfrm>
+                    <a:prstGeom prst="rect">
+                      <a:avLst/>
+                    </a:prstGeom>
+                  </pic:spPr>
+                </pic:pic>
+              </a:graphicData>
+            </a:graphic>
+          </wp:inline>
+        </w:drawing>
+      </w:r>
+    </w:p>
+    <w:p/>
+    <w:p/>
+    <w:p/>
+    <w:p/>
+    <w:p>
+      <w:r>
+        <w:drawing>
+          <wp:inline distT="0" distB="0" distL="0" distR="0" wp14:anchorId="4D13DDB9" wp14:editId="3BCCD931">
+            <wp:extent cx="5943600" cy="3065145"/>
+            <wp:effectExtent l="0" t="0" r="0" b="1905"/>
+            <wp:docPr id="514044390" name="Picture 1"/>
+            <wp:cNvGraphicFramePr>
+              <a:graphicFrameLocks xmlns:a="http://schemas.openxmlformats.org/drawingml/2006/main" noChangeAspect="1"/>
+            </wp:cNvGraphicFramePr>
+            <a:graphic xmlns:a="http://schemas.openxmlformats.org/drawingml/2006/main">
+              <a:graphicData uri="http://schemas.openxmlformats.org/drawingml/2006/picture">
+                <pic:pic xmlns:pic="http://schemas.openxmlformats.org/drawingml/2006/picture">
+                  <pic:nvPicPr>
+                    <pic:cNvPr id="514044390" name=""/>
+                    <pic:cNvPicPr/>
+                  </pic:nvPicPr>
+                  <pic:blipFill>
+                    <a:blip r:embed="rId11"/>
+                    <a:stretch>
+                      <a:fillRect/>
+                    </a:stretch>
+                  </pic:blipFill>
+                  <pic:spPr>
+                    <a:xfrm>
+                      <a:off x="0" y="0"/>
+                      <a:ext cx="5943600" cy="3065145"/>
                     </a:xfrm>
                     <a:prstGeom prst="rect">
                       <a:avLst/>

</xml_diff>

<commit_message>
To Implement Service Requests 2026 and Display Proper Count with Category(Service Requests, Transferred to Vendor & Closed)
</commit_message>
<xml_diff>
--- a/claimed-raised/current_claimed.docx
+++ b/claimed-raised/current_claimed.docx
@@ -7,7 +7,15 @@
     <w:p/>
     <w:p>
       <w:r>
-        <w:t>WITH year_bounds AS (</w:t>
+        <w:t xml:space="preserve">WITH </w:t>
+      </w:r>
+      <w:proofErr w:type="spellStart"/>
+      <w:r>
+        <w:t>year_bounds</w:t>
+      </w:r>
+      <w:proofErr w:type="spellEnd"/>
+      <w:r>
+        <w:t xml:space="preserve"> AS (</w:t>
       </w:r>
     </w:p>
     <w:p>
@@ -17,13 +25,58 @@
     </w:p>
     <w:p>
       <w:r>
-        <w:t xml:space="preserve">        DATE_TRUNC('year', CURRENT_DATE)::date AS year_start,</w:t>
-      </w:r>
-    </w:p>
-    <w:p>
-      <w:r>
-        <w:t xml:space="preserve">        (DATE_TRUNC('year', CURRENT_DATE) + INTERVAL '1 year')::date AS next_year_start</w:t>
-      </w:r>
+        <w:t xml:space="preserve">        DATE_</w:t>
+      </w:r>
+      <w:proofErr w:type="gramStart"/>
+      <w:r>
+        <w:t>TRUNC(</w:t>
+      </w:r>
+      <w:proofErr w:type="gramEnd"/>
+      <w:r>
+        <w:t>'year', CURRENT_DATE</w:t>
+      </w:r>
+      <w:proofErr w:type="gramStart"/>
+      <w:r>
+        <w:t>)::</w:t>
+      </w:r>
+      <w:proofErr w:type="gramEnd"/>
+      <w:r>
+        <w:t xml:space="preserve">date AS </w:t>
+      </w:r>
+      <w:proofErr w:type="spellStart"/>
+      <w:r>
+        <w:t>year_start</w:t>
+      </w:r>
+      <w:proofErr w:type="spellEnd"/>
+      <w:r>
+        <w:t>,</w:t>
+      </w:r>
+    </w:p>
+    <w:p>
+      <w:r>
+        <w:t xml:space="preserve">        (DATE_</w:t>
+      </w:r>
+      <w:proofErr w:type="gramStart"/>
+      <w:r>
+        <w:t>TRUNC(</w:t>
+      </w:r>
+      <w:proofErr w:type="gramEnd"/>
+      <w:r>
+        <w:t>'year', CURRENT_DATE) + INTERVAL '1 year'</w:t>
+      </w:r>
+      <w:proofErr w:type="gramStart"/>
+      <w:r>
+        <w:t>)::</w:t>
+      </w:r>
+      <w:proofErr w:type="gramEnd"/>
+      <w:r>
+        <w:t xml:space="preserve">date AS </w:t>
+      </w:r>
+      <w:proofErr w:type="spellStart"/>
+      <w:r>
+        <w:t>next_year_start</w:t>
+      </w:r>
+      <w:proofErr w:type="spellEnd"/>
     </w:p>
     <w:p>
       <w:r>
@@ -32,59 +85,225 @@
     </w:p>
     <w:p/>
     <w:p>
-      <w:r>
-        <w:t>recovered_rows AS (</w:t>
-      </w:r>
-    </w:p>
-    <w:p>
-      <w:r>
-        <w:t xml:space="preserve">    SELECT DISTINCT ON (dc.reference_no_claim)</w:t>
-      </w:r>
-    </w:p>
-    <w:p>
-      <w:r>
-        <w:t xml:space="preserve">        dc.reference_no_claim,</w:t>
-      </w:r>
-    </w:p>
-    <w:p>
-      <w:r>
-        <w:t xml:space="preserve">        dc.return_date AS closing_date</w:t>
-      </w:r>
-    </w:p>
-    <w:p>
-      <w:r>
-        <w:t xml:space="preserve">    FROM public.device_claims dc</w:t>
-      </w:r>
-    </w:p>
-    <w:p>
-      <w:r>
-        <w:t xml:space="preserve">    CROSS JOIN year_bounds yb</w:t>
-      </w:r>
-    </w:p>
-    <w:p>
-      <w:r>
-        <w:t xml:space="preserve">    WHERE dc.claim_status = 10</w:t>
-      </w:r>
-    </w:p>
-    <w:p>
-      <w:r>
-        <w:t xml:space="preserve">      AND dc.reference_no_claim IS NOT NULL</w:t>
-      </w:r>
-    </w:p>
-    <w:p>
-      <w:r>
-        <w:t xml:space="preserve">      AND dc.return_date IS NOT NULL</w:t>
-      </w:r>
-    </w:p>
-    <w:p>
-      <w:r>
-        <w:t xml:space="preserve">      AND dc.return_date::date &gt;= yb.year_start</w:t>
-      </w:r>
-    </w:p>
-    <w:p>
-      <w:r>
-        <w:t xml:space="preserve">      AND dc.return_date::date &lt; yb.next_year_start</w:t>
-      </w:r>
+      <w:proofErr w:type="spellStart"/>
+      <w:r>
+        <w:t>recovered_rows</w:t>
+      </w:r>
+      <w:proofErr w:type="spellEnd"/>
+      <w:r>
+        <w:t xml:space="preserve"> AS (</w:t>
+      </w:r>
+    </w:p>
+    <w:p>
+      <w:r>
+        <w:t xml:space="preserve">    SELECT DISTINCT ON (</w:t>
+      </w:r>
+      <w:proofErr w:type="spellStart"/>
+      <w:proofErr w:type="gramStart"/>
+      <w:r>
+        <w:t>dc.reference</w:t>
+      </w:r>
+      <w:proofErr w:type="gramEnd"/>
+      <w:r>
+        <w:t>_no_claim</w:t>
+      </w:r>
+      <w:proofErr w:type="spellEnd"/>
+      <w:r>
+        <w:t>)</w:t>
+      </w:r>
+    </w:p>
+    <w:p>
+      <w:r>
+        <w:t xml:space="preserve">        </w:t>
+      </w:r>
+      <w:proofErr w:type="spellStart"/>
+      <w:r>
+        <w:t>dc.reference_no_claim</w:t>
+      </w:r>
+      <w:proofErr w:type="spellEnd"/>
+      <w:r>
+        <w:t>,</w:t>
+      </w:r>
+    </w:p>
+    <w:p>
+      <w:r>
+        <w:t xml:space="preserve">        </w:t>
+      </w:r>
+      <w:proofErr w:type="spellStart"/>
+      <w:r>
+        <w:t>dc.return_date</w:t>
+      </w:r>
+      <w:proofErr w:type="spellEnd"/>
+      <w:r>
+        <w:t xml:space="preserve"> AS </w:t>
+      </w:r>
+      <w:proofErr w:type="spellStart"/>
+      <w:r>
+        <w:t>closing_date</w:t>
+      </w:r>
+      <w:proofErr w:type="spellEnd"/>
+    </w:p>
+    <w:p>
+      <w:r>
+        <w:t xml:space="preserve">    FROM </w:t>
+      </w:r>
+      <w:proofErr w:type="spellStart"/>
+      <w:proofErr w:type="gramStart"/>
+      <w:r>
+        <w:t>public.device</w:t>
+      </w:r>
+      <w:proofErr w:type="gramEnd"/>
+      <w:r>
+        <w:t>_claims</w:t>
+      </w:r>
+      <w:proofErr w:type="spellEnd"/>
+      <w:r>
+        <w:t xml:space="preserve"> dc</w:t>
+      </w:r>
+    </w:p>
+    <w:p>
+      <w:r>
+        <w:t xml:space="preserve">    CROSS JOIN </w:t>
+      </w:r>
+      <w:proofErr w:type="spellStart"/>
+      <w:r>
+        <w:t>year_bounds</w:t>
+      </w:r>
+      <w:proofErr w:type="spellEnd"/>
+      <w:r>
+        <w:t xml:space="preserve"> </w:t>
+      </w:r>
+      <w:proofErr w:type="spellStart"/>
+      <w:r>
+        <w:t>yb</w:t>
+      </w:r>
+      <w:proofErr w:type="spellEnd"/>
+    </w:p>
+    <w:p>
+      <w:r>
+        <w:t xml:space="preserve">    WHERE </w:t>
+      </w:r>
+      <w:proofErr w:type="spellStart"/>
+      <w:proofErr w:type="gramStart"/>
+      <w:r>
+        <w:t>dc.claim</w:t>
+      </w:r>
+      <w:proofErr w:type="gramEnd"/>
+      <w:r>
+        <w:t>_status</w:t>
+      </w:r>
+      <w:proofErr w:type="spellEnd"/>
+      <w:r>
+        <w:t xml:space="preserve"> = 10</w:t>
+      </w:r>
+    </w:p>
+    <w:p>
+      <w:r>
+        <w:t xml:space="preserve">      AND </w:t>
+      </w:r>
+      <w:proofErr w:type="spellStart"/>
+      <w:proofErr w:type="gramStart"/>
+      <w:r>
+        <w:t>dc.reference</w:t>
+      </w:r>
+      <w:proofErr w:type="gramEnd"/>
+      <w:r>
+        <w:t>_no_claim</w:t>
+      </w:r>
+      <w:proofErr w:type="spellEnd"/>
+      <w:r>
+        <w:t xml:space="preserve"> IS NOT NULL</w:t>
+      </w:r>
+    </w:p>
+    <w:p>
+      <w:r>
+        <w:t xml:space="preserve">      AND </w:t>
+      </w:r>
+      <w:proofErr w:type="spellStart"/>
+      <w:proofErr w:type="gramStart"/>
+      <w:r>
+        <w:t>dc.return</w:t>
+      </w:r>
+      <w:proofErr w:type="gramEnd"/>
+      <w:r>
+        <w:t>_date</w:t>
+      </w:r>
+      <w:proofErr w:type="spellEnd"/>
+      <w:r>
+        <w:t xml:space="preserve"> IS NOT NULL</w:t>
+      </w:r>
+    </w:p>
+    <w:p>
+      <w:r>
+        <w:t xml:space="preserve">      AND </w:t>
+      </w:r>
+      <w:proofErr w:type="spellStart"/>
+      <w:proofErr w:type="gramStart"/>
+      <w:r>
+        <w:t>dc.return</w:t>
+      </w:r>
+      <w:proofErr w:type="gramEnd"/>
+      <w:r>
+        <w:t>_</w:t>
+      </w:r>
+      <w:proofErr w:type="gramStart"/>
+      <w:r>
+        <w:t>date</w:t>
+      </w:r>
+      <w:proofErr w:type="spellEnd"/>
+      <w:r>
+        <w:t>::</w:t>
+      </w:r>
+      <w:proofErr w:type="gramEnd"/>
+      <w:r>
+        <w:t xml:space="preserve">date &gt;= </w:t>
+      </w:r>
+      <w:proofErr w:type="spellStart"/>
+      <w:proofErr w:type="gramStart"/>
+      <w:r>
+        <w:t>yb.year</w:t>
+      </w:r>
+      <w:proofErr w:type="gramEnd"/>
+      <w:r>
+        <w:t>_start</w:t>
+      </w:r>
+      <w:proofErr w:type="spellEnd"/>
+    </w:p>
+    <w:p>
+      <w:r>
+        <w:t xml:space="preserve">      AND </w:t>
+      </w:r>
+      <w:proofErr w:type="spellStart"/>
+      <w:proofErr w:type="gramStart"/>
+      <w:r>
+        <w:t>dc.return</w:t>
+      </w:r>
+      <w:proofErr w:type="gramEnd"/>
+      <w:r>
+        <w:t>_</w:t>
+      </w:r>
+      <w:proofErr w:type="gramStart"/>
+      <w:r>
+        <w:t>date</w:t>
+      </w:r>
+      <w:proofErr w:type="spellEnd"/>
+      <w:r>
+        <w:t>::</w:t>
+      </w:r>
+      <w:proofErr w:type="gramEnd"/>
+      <w:r>
+        <w:t xml:space="preserve">date &lt; </w:t>
+      </w:r>
+      <w:proofErr w:type="spellStart"/>
+      <w:proofErr w:type="gramStart"/>
+      <w:r>
+        <w:t>yb.next</w:t>
+      </w:r>
+      <w:proofErr w:type="gramEnd"/>
+      <w:r>
+        <w:t>_year_start</w:t>
+      </w:r>
+      <w:proofErr w:type="spellEnd"/>
     </w:p>
     <w:p>
       <w:r>
@@ -93,12 +312,28 @@
     </w:p>
     <w:p>
       <w:r>
-        <w:t xml:space="preserve">        dc.reference_no_claim,</w:t>
-      </w:r>
-    </w:p>
-    <w:p>
-      <w:r>
-        <w:t xml:space="preserve">        dc.return_date DESC NULLS LAST,</w:t>
+        <w:t xml:space="preserve">        </w:t>
+      </w:r>
+      <w:proofErr w:type="spellStart"/>
+      <w:r>
+        <w:t>dc.reference_no_claim</w:t>
+      </w:r>
+      <w:proofErr w:type="spellEnd"/>
+      <w:r>
+        <w:t>,</w:t>
+      </w:r>
+    </w:p>
+    <w:p>
+      <w:r>
+        <w:t xml:space="preserve">        </w:t>
+      </w:r>
+      <w:proofErr w:type="spellStart"/>
+      <w:r>
+        <w:t>dc.return_date</w:t>
+      </w:r>
+      <w:proofErr w:type="spellEnd"/>
+      <w:r>
+        <w:t xml:space="preserve"> DESC NULLS LAST,</w:t>
       </w:r>
     </w:p>
     <w:p>
@@ -115,12 +350,33 @@
     <w:p>
       <w:r>
         <w:lastRenderedPageBreak/>
-        <w:t>SELECT COUNT(*) AS recovered_count</w:t>
-      </w:r>
-    </w:p>
-    <w:p>
-      <w:r>
-        <w:t>FROM recovered_rows;</w:t>
+        <w:t xml:space="preserve">SELECT </w:t>
+      </w:r>
+      <w:proofErr w:type="gramStart"/>
+      <w:r>
+        <w:t>COUNT(</w:t>
+      </w:r>
+      <w:proofErr w:type="gramEnd"/>
+      <w:r>
+        <w:t xml:space="preserve">*) AS </w:t>
+      </w:r>
+      <w:proofErr w:type="spellStart"/>
+      <w:r>
+        <w:t>recovered_count</w:t>
+      </w:r>
+      <w:proofErr w:type="spellEnd"/>
+    </w:p>
+    <w:p>
+      <w:r>
+        <w:t xml:space="preserve">FROM </w:t>
+      </w:r>
+      <w:proofErr w:type="spellStart"/>
+      <w:r>
+        <w:t>recovered_rows</w:t>
+      </w:r>
+      <w:proofErr w:type="spellEnd"/>
+      <w:r>
+        <w:t>;</w:t>
       </w:r>
     </w:p>
     <w:p/>
@@ -175,48 +431,208 @@
     </w:p>
     <w:p>
       <w:r>
-        <w:t xml:space="preserve">    dc.reference_no_claim,</w:t>
-      </w:r>
-    </w:p>
-    <w:p>
-      <w:r>
-        <w:t xml:space="preserve">    MAX(dc.return_date) AS closing_date</w:t>
-      </w:r>
-    </w:p>
-    <w:p>
-      <w:r>
-        <w:t>FROM public.device_claims dc</w:t>
-      </w:r>
-    </w:p>
-    <w:p>
-      <w:r>
-        <w:t>WHERE dc.claim_status = 10</w:t>
-      </w:r>
-    </w:p>
-    <w:p>
-      <w:r>
-        <w:t xml:space="preserve">  AND dc.return_date IS NOT NULL</w:t>
-      </w:r>
-    </w:p>
-    <w:p>
-      <w:r>
-        <w:t xml:space="preserve">  AND dc.return_date::date &gt;= DATE_TRUNC('year', CURRENT_DATE)::date</w:t>
+        <w:t xml:space="preserve">    </w:t>
+      </w:r>
+      <w:proofErr w:type="spellStart"/>
+      <w:r>
+        <w:t>dc.reference_no_claim</w:t>
+      </w:r>
+      <w:proofErr w:type="spellEnd"/>
+      <w:r>
+        <w:t>,</w:t>
+      </w:r>
+    </w:p>
+    <w:p>
+      <w:r>
+        <w:t xml:space="preserve">    </w:t>
+      </w:r>
+      <w:proofErr w:type="gramStart"/>
+      <w:r>
+        <w:t>MAX(</w:t>
+      </w:r>
+      <w:proofErr w:type="spellStart"/>
+      <w:r>
+        <w:t>dc.return</w:t>
+      </w:r>
+      <w:proofErr w:type="gramEnd"/>
+      <w:r>
+        <w:t>_date</w:t>
+      </w:r>
+      <w:proofErr w:type="spellEnd"/>
+      <w:r>
+        <w:t xml:space="preserve">) AS </w:t>
+      </w:r>
+      <w:proofErr w:type="spellStart"/>
+      <w:r>
+        <w:t>closing_date</w:t>
+      </w:r>
+      <w:proofErr w:type="spellEnd"/>
+    </w:p>
+    <w:p>
+      <w:r>
+        <w:t xml:space="preserve">FROM </w:t>
+      </w:r>
+      <w:proofErr w:type="spellStart"/>
+      <w:proofErr w:type="gramStart"/>
+      <w:r>
+        <w:t>public.device</w:t>
+      </w:r>
+      <w:proofErr w:type="gramEnd"/>
+      <w:r>
+        <w:t>_claims</w:t>
+      </w:r>
+      <w:proofErr w:type="spellEnd"/>
+      <w:r>
+        <w:t xml:space="preserve"> dc</w:t>
+      </w:r>
+    </w:p>
+    <w:p>
+      <w:r>
+        <w:t xml:space="preserve">WHERE </w:t>
+      </w:r>
+      <w:proofErr w:type="spellStart"/>
+      <w:proofErr w:type="gramStart"/>
+      <w:r>
+        <w:t>dc.claim</w:t>
+      </w:r>
+      <w:proofErr w:type="gramEnd"/>
+      <w:r>
+        <w:t>_status</w:t>
+      </w:r>
+      <w:proofErr w:type="spellEnd"/>
+      <w:r>
+        <w:t xml:space="preserve"> = 10</w:t>
+      </w:r>
+    </w:p>
+    <w:p>
+      <w:r>
+        <w:t xml:space="preserve">  AND </w:t>
+      </w:r>
+      <w:proofErr w:type="spellStart"/>
+      <w:proofErr w:type="gramStart"/>
+      <w:r>
+        <w:t>dc.return</w:t>
+      </w:r>
+      <w:proofErr w:type="gramEnd"/>
+      <w:r>
+        <w:t>_date</w:t>
+      </w:r>
+      <w:proofErr w:type="spellEnd"/>
+      <w:r>
+        <w:t xml:space="preserve"> IS NOT NULL</w:t>
+      </w:r>
+    </w:p>
+    <w:p>
+      <w:r>
+        <w:t xml:space="preserve">  AND </w:t>
+      </w:r>
+      <w:proofErr w:type="spellStart"/>
+      <w:proofErr w:type="gramStart"/>
+      <w:r>
+        <w:t>dc.return</w:t>
+      </w:r>
+      <w:proofErr w:type="gramEnd"/>
+      <w:r>
+        <w:t>_</w:t>
+      </w:r>
+      <w:proofErr w:type="gramStart"/>
+      <w:r>
+        <w:t>date</w:t>
+      </w:r>
+      <w:proofErr w:type="spellEnd"/>
+      <w:r>
+        <w:t>::</w:t>
+      </w:r>
+      <w:proofErr w:type="gramEnd"/>
+      <w:r>
+        <w:t>date &gt;= DATE_</w:t>
+      </w:r>
+      <w:proofErr w:type="gramStart"/>
+      <w:r>
+        <w:t>TRUNC(</w:t>
+      </w:r>
+      <w:proofErr w:type="gramEnd"/>
+      <w:r>
+        <w:t>'year', CURRENT_DATE</w:t>
+      </w:r>
+      <w:proofErr w:type="gramStart"/>
+      <w:r>
+        <w:t>)::</w:t>
+      </w:r>
+      <w:proofErr w:type="gramEnd"/>
+      <w:r>
+        <w:t>date</w:t>
       </w:r>
     </w:p>
     <w:p>
       <w:r>
         <w:lastRenderedPageBreak/>
-        <w:t xml:space="preserve">  AND dc.return_date::date &lt; (DATE_TRUNC('year', CURRENT_DATE) + INTERVAL '1 year')::date</w:t>
-      </w:r>
-    </w:p>
-    <w:p>
-      <w:r>
-        <w:t>GROUP BY dc.reference_no_claim</w:t>
-      </w:r>
-    </w:p>
-    <w:p>
-      <w:r>
-        <w:t>ORDER BY closing_date DESC;</w:t>
+        <w:t xml:space="preserve">  AND </w:t>
+      </w:r>
+      <w:proofErr w:type="spellStart"/>
+      <w:proofErr w:type="gramStart"/>
+      <w:r>
+        <w:t>dc.return</w:t>
+      </w:r>
+      <w:proofErr w:type="gramEnd"/>
+      <w:r>
+        <w:t>_</w:t>
+      </w:r>
+      <w:proofErr w:type="gramStart"/>
+      <w:r>
+        <w:t>date</w:t>
+      </w:r>
+      <w:proofErr w:type="spellEnd"/>
+      <w:r>
+        <w:t>::</w:t>
+      </w:r>
+      <w:proofErr w:type="gramEnd"/>
+      <w:r>
+        <w:t>date &lt; (DATE_</w:t>
+      </w:r>
+      <w:proofErr w:type="gramStart"/>
+      <w:r>
+        <w:t>TRUNC(</w:t>
+      </w:r>
+      <w:proofErr w:type="gramEnd"/>
+      <w:r>
+        <w:t>'year', CURRENT_DATE) + INTERVAL '1 year'</w:t>
+      </w:r>
+      <w:proofErr w:type="gramStart"/>
+      <w:r>
+        <w:t>)::</w:t>
+      </w:r>
+      <w:proofErr w:type="gramEnd"/>
+      <w:r>
+        <w:t>date</w:t>
+      </w:r>
+    </w:p>
+    <w:p>
+      <w:r>
+        <w:t xml:space="preserve">GROUP BY </w:t>
+      </w:r>
+      <w:proofErr w:type="spellStart"/>
+      <w:proofErr w:type="gramStart"/>
+      <w:r>
+        <w:t>dc.reference</w:t>
+      </w:r>
+      <w:proofErr w:type="gramEnd"/>
+      <w:r>
+        <w:t>_no_claim</w:t>
+      </w:r>
+      <w:proofErr w:type="spellEnd"/>
+    </w:p>
+    <w:p>
+      <w:r>
+        <w:t xml:space="preserve">ORDER BY </w:t>
+      </w:r>
+      <w:proofErr w:type="spellStart"/>
+      <w:r>
+        <w:t>closing_date</w:t>
+      </w:r>
+      <w:proofErr w:type="spellEnd"/>
+      <w:r>
+        <w:t xml:space="preserve"> DESC;</w:t>
       </w:r>
     </w:p>
     <w:p/>
@@ -278,42 +694,159 @@
     </w:p>
     <w:p>
       <w:r>
-        <w:t xml:space="preserve">    h.claim_reference_no,</w:t>
-      </w:r>
-    </w:p>
-    <w:p>
-      <w:r>
-        <w:t xml:space="preserve">    MAX(h.created_at) AS closing_date</w:t>
-      </w:r>
-    </w:p>
-    <w:p>
-      <w:r>
-        <w:t>FROM public.device_claim_histories h</w:t>
-      </w:r>
-    </w:p>
-    <w:p>
-      <w:r>
-        <w:t>WHERE h.current_status = 10</w:t>
-      </w:r>
-    </w:p>
-    <w:p>
-      <w:r>
-        <w:t xml:space="preserve">  AND h.created_at &gt;= DATE_TRUNC('year', CURRENT_DATE)</w:t>
-      </w:r>
-    </w:p>
-    <w:p>
-      <w:r>
-        <w:t xml:space="preserve">  AND h.created_at &lt; DATE_TRUNC('year', CURRENT_DATE) + INTERVAL '1 year'</w:t>
-      </w:r>
-    </w:p>
-    <w:p>
-      <w:r>
-        <w:t>GROUP BY h.claim_reference_no</w:t>
-      </w:r>
-    </w:p>
-    <w:p>
-      <w:r>
-        <w:t>ORDER BY closing_date DESC;</w:t>
+        <w:t xml:space="preserve">    </w:t>
+      </w:r>
+      <w:proofErr w:type="spellStart"/>
+      <w:proofErr w:type="gramStart"/>
+      <w:r>
+        <w:t>h.claim</w:t>
+      </w:r>
+      <w:proofErr w:type="gramEnd"/>
+      <w:r>
+        <w:t>_reference_no</w:t>
+      </w:r>
+      <w:proofErr w:type="spellEnd"/>
+      <w:r>
+        <w:t>,</w:t>
+      </w:r>
+    </w:p>
+    <w:p>
+      <w:r>
+        <w:t xml:space="preserve">    MAX(</w:t>
+      </w:r>
+      <w:proofErr w:type="spellStart"/>
+      <w:proofErr w:type="gramStart"/>
+      <w:r>
+        <w:t>h.created</w:t>
+      </w:r>
+      <w:proofErr w:type="gramEnd"/>
+      <w:r>
+        <w:t>_at</w:t>
+      </w:r>
+      <w:proofErr w:type="spellEnd"/>
+      <w:r>
+        <w:t xml:space="preserve">) AS </w:t>
+      </w:r>
+      <w:proofErr w:type="spellStart"/>
+      <w:r>
+        <w:t>closing_date</w:t>
+      </w:r>
+      <w:proofErr w:type="spellEnd"/>
+    </w:p>
+    <w:p>
+      <w:r>
+        <w:t xml:space="preserve">FROM </w:t>
+      </w:r>
+      <w:proofErr w:type="spellStart"/>
+      <w:proofErr w:type="gramStart"/>
+      <w:r>
+        <w:t>public.device</w:t>
+      </w:r>
+      <w:proofErr w:type="gramEnd"/>
+      <w:r>
+        <w:t>_claim_histories</w:t>
+      </w:r>
+      <w:proofErr w:type="spellEnd"/>
+      <w:r>
+        <w:t xml:space="preserve"> h</w:t>
+      </w:r>
+    </w:p>
+    <w:p>
+      <w:r>
+        <w:t xml:space="preserve">WHERE </w:t>
+      </w:r>
+      <w:proofErr w:type="spellStart"/>
+      <w:proofErr w:type="gramStart"/>
+      <w:r>
+        <w:t>h.current</w:t>
+      </w:r>
+      <w:proofErr w:type="gramEnd"/>
+      <w:r>
+        <w:t>_status</w:t>
+      </w:r>
+      <w:proofErr w:type="spellEnd"/>
+      <w:r>
+        <w:t xml:space="preserve"> = 10</w:t>
+      </w:r>
+    </w:p>
+    <w:p>
+      <w:r>
+        <w:t xml:space="preserve">  AND </w:t>
+      </w:r>
+      <w:proofErr w:type="spellStart"/>
+      <w:proofErr w:type="gramStart"/>
+      <w:r>
+        <w:t>h.created</w:t>
+      </w:r>
+      <w:proofErr w:type="gramEnd"/>
+      <w:r>
+        <w:t>_at</w:t>
+      </w:r>
+      <w:proofErr w:type="spellEnd"/>
+      <w:r>
+        <w:t xml:space="preserve"> &gt;= DATE_</w:t>
+      </w:r>
+      <w:proofErr w:type="gramStart"/>
+      <w:r>
+        <w:t>TRUNC(</w:t>
+      </w:r>
+      <w:proofErr w:type="gramEnd"/>
+      <w:r>
+        <w:t>'year', CURRENT_DATE)</w:t>
+      </w:r>
+    </w:p>
+    <w:p>
+      <w:r>
+        <w:t xml:space="preserve">  AND </w:t>
+      </w:r>
+      <w:proofErr w:type="spellStart"/>
+      <w:proofErr w:type="gramStart"/>
+      <w:r>
+        <w:t>h.created</w:t>
+      </w:r>
+      <w:proofErr w:type="gramEnd"/>
+      <w:r>
+        <w:t>_at</w:t>
+      </w:r>
+      <w:proofErr w:type="spellEnd"/>
+      <w:r>
+        <w:t xml:space="preserve"> &lt; DATE_</w:t>
+      </w:r>
+      <w:proofErr w:type="gramStart"/>
+      <w:r>
+        <w:t>TRUNC(</w:t>
+      </w:r>
+      <w:proofErr w:type="gramEnd"/>
+      <w:r>
+        <w:t>'year', CURRENT_DATE) + INTERVAL '1 year'</w:t>
+      </w:r>
+    </w:p>
+    <w:p>
+      <w:r>
+        <w:t xml:space="preserve">GROUP BY </w:t>
+      </w:r>
+      <w:proofErr w:type="spellStart"/>
+      <w:proofErr w:type="gramStart"/>
+      <w:r>
+        <w:t>h.claim</w:t>
+      </w:r>
+      <w:proofErr w:type="gramEnd"/>
+      <w:r>
+        <w:t>_reference_no</w:t>
+      </w:r>
+      <w:proofErr w:type="spellEnd"/>
+    </w:p>
+    <w:p>
+      <w:r>
+        <w:t xml:space="preserve">ORDER BY </w:t>
+      </w:r>
+      <w:proofErr w:type="spellStart"/>
+      <w:r>
+        <w:t>closing_date</w:t>
+      </w:r>
+      <w:proofErr w:type="spellEnd"/>
+      <w:r>
+        <w:t xml:space="preserve"> DESC;</w:t>
       </w:r>
     </w:p>
     <w:p/>
@@ -578,6 +1111,81 @@
     </w:p>
     <w:p/>
     <w:p/>
+    <w:tbl>
+      <w:tblPr>
+        <w:tblW w:w="2783" w:type="dxa"/>
+        <w:tblBorders>
+          <w:top w:val="single" w:sz="2" w:space="0" w:color="auto"/>
+          <w:left w:val="single" w:sz="2" w:space="0" w:color="auto"/>
+          <w:bottom w:val="single" w:sz="2" w:space="0" w:color="auto"/>
+          <w:right w:val="single" w:sz="2" w:space="0" w:color="auto"/>
+        </w:tblBorders>
+        <w:shd w:val="clear" w:color="auto" w:fill="FFFFFF"/>
+        <w:tblCellMar>
+          <w:left w:w="0" w:type="dxa"/>
+          <w:right w:w="0" w:type="dxa"/>
+        </w:tblCellMar>
+        <w:tblLook w:val="04A0" w:firstRow="1" w:lastRow="0" w:firstColumn="1" w:lastColumn="0" w:noHBand="0" w:noVBand="1"/>
+      </w:tblPr>
+      <w:tblGrid>
+        <w:gridCol w:w="2535"/>
+        <w:gridCol w:w="248"/>
+      </w:tblGrid>
+      <w:tr>
+        <w:trPr>
+          <w:trHeight w:val="407"/>
+        </w:trPr>
+        <w:tc>
+          <w:tcPr>
+            <w:tcW w:w="0" w:type="auto"/>
+            <w:tcBorders>
+              <w:top w:val="single" w:sz="2" w:space="0" w:color="E5E7EB"/>
+              <w:left w:val="single" w:sz="2" w:space="0" w:color="E5E7EB"/>
+              <w:bottom w:val="single" w:sz="2" w:space="0" w:color="E5E7EB"/>
+              <w:right w:val="single" w:sz="2" w:space="0" w:color="E5E7EB"/>
+            </w:tcBorders>
+            <w:shd w:val="clear" w:color="auto" w:fill="FFFFFF"/>
+            <w:noWrap/>
+            <w:tcMar>
+              <w:top w:w="98" w:type="dxa"/>
+              <w:left w:w="98" w:type="dxa"/>
+              <w:bottom w:w="98" w:type="dxa"/>
+              <w:right w:w="98" w:type="dxa"/>
+            </w:tcMar>
+            <w:vAlign w:val="center"/>
+            <w:hideMark/>
+          </w:tcPr>
+          <w:p>
+            <w:r>
+              <w:lastRenderedPageBreak/>
+              <w:t>DELL VOSTRO 3400</w:t>
+            </w:r>
+          </w:p>
+        </w:tc>
+        <w:tc>
+          <w:tcPr>
+            <w:tcW w:w="0" w:type="auto"/>
+            <w:tcBorders>
+              <w:top w:val="single" w:sz="2" w:space="0" w:color="E5E7EB"/>
+              <w:left w:val="single" w:sz="2" w:space="0" w:color="E5E7EB"/>
+              <w:bottom w:val="single" w:sz="2" w:space="0" w:color="E5E7EB"/>
+              <w:right w:val="single" w:sz="2" w:space="0" w:color="E5E7EB"/>
+            </w:tcBorders>
+            <w:shd w:val="clear" w:color="auto" w:fill="FFFFFF"/>
+            <w:noWrap/>
+            <w:tcMar>
+              <w:top w:w="98" w:type="dxa"/>
+              <w:left w:w="98" w:type="dxa"/>
+              <w:bottom w:w="98" w:type="dxa"/>
+              <w:right w:w="98" w:type="dxa"/>
+            </w:tcMar>
+            <w:vAlign w:val="center"/>
+            <w:hideMark/>
+          </w:tcPr>
+          <w:p/>
+        </w:tc>
+      </w:tr>
+    </w:tbl>
     <w:p/>
     <w:p/>
     <w:p>

</xml_diff>